<commit_message>
Second-pass cover photo fixes on two more articles
cast-iron-rust-free: swapped a rusty blacksmith hammer on concrete (not a
woodworking tool at all) for a real bandsaw table + blade close-up, per
direct feedback to actually show a woodworking tool in the shot.

dust-collection-setup: the first replacement (a shop vac on tile flooring)
still wasn't a strong enough match per feedback -- swapped again for a
photo showing two real fabric-bag dust collectors with drop pipes in an
actual wood shop next to a table saw. Also updates the live production
file (images/garage-tips/dust-collection-cover.jpg) again to match.

Co-Authored-By: Claude Sonnet 5 <noreply@anthropic.com>
</commit_message>
<xml_diff>
--- a/Articles/01-cast-iron-rust-free/article.docx
+++ b/Articles/01-cast-iron-rust-free/article.docx
@@ -34,7 +34,7 @@
       <w:r>
         <w:drawing>
           <wp:inline distT="0" distB="0" distL="0" distR="0">
-            <wp:extent cx="5486400" cy="4584179"/>
+            <wp:extent cx="5486400" cy="8229600"/>
             <wp:docPr id="1" name="Cover"/>
             <wp:cNvGraphicFramePr>
               <a:graphicFrameLocks noChangeAspect="1"/>
@@ -55,7 +55,7 @@
                   <pic:spPr>
                     <a:xfrm>
                       <a:off x="0" y="0"/>
-                      <a:ext cx="5486400" cy="4584179"/>
+                      <a:ext cx="5486400" cy="8229600"/>
                     </a:xfrm>
                     <a:prstGeom prst="rect">
                       <a:avLst/>

</xml_diff>

<commit_message>
Rewrite cast-iron-rust-free as a voice-match test
Test run applying the user's own writing voice (from 5 samples of their
personal writing) to one article, before doing the same across all 18.
Same facts, same affiliate links, same photo placeholders -- only the
prose itself changed: shorter stacked sentences for emphasis, "simple
answer vs. real answer" framing, honest acknowledgment before the pivot,
concrete plain language over dressed-up vocabulary. Awaiting a verdict
before touching the other 17.

Co-Authored-By: Claude Sonnet 5 <noreply@anthropic.com>
</commit_message>
<xml_diff>
--- a/Articles/01-cast-iron-rust-free/article.docx
+++ b/Articles/01-cast-iron-rust-free/article.docx
@@ -70,7 +70,7 @@
     </w:p>
     <w:p>
       <w:r>
-        <w:t xml:space="preserve">A flat, rust-free cast iron top isn't cosmetic — it's a reference surface. The second it develops pits or a hazy orange bloom, your stock stops sliding true and your measurements start lying to you. The good news is that keeping a table saw, jointer, or bandsaw top rust-free takes about two minutes a week once you've got the routine down. The bad news is most people only think about it after they've already got rust to deal with.</w:t>
+        <w:t xml:space="preserve">Let's get one thing straight up front: rust on a cast iron top isn't a cosmetic problem. It's a flatness problem. The second that surface pits or hazes over orange, your stock stops sliding true and your measurements start lying to you — and you won't find out until a cut comes out wrong. Here's the part nobody wants to hear: keeping it rust-free takes about two minutes a week. The real problem was never the work. It's that almost nobody does it until they've already got rust staring back at them.</w:t>
       </w:r>
     </w:p>
     <w:p>
@@ -83,7 +83,7 @@
     </w:p>
     <w:p>
       <w:r>
-        <w:t xml:space="preserve">Cast iron is porous at a microscopic level, and it doesn't take much to set off oxidation. Three things do most of the damage in a home or small shop:</w:t>
+        <w:t xml:space="preserve">What's actually attacking your table? Not one big thing — three small ones, and they're all avoidable once you know what you're looking at.</w:t>
       </w:r>
     </w:p>
     <w:p>
@@ -94,7 +94,7 @@
         <w:t xml:space="preserve">Humidity swings.</w:t>
       </w:r>
       <w:r>
-        <w:t xml:space="preserve"> Iron doesn't need standing water to rust — ambient moisture in the 55-70% relative humidity range is enough, especially with temperature swings that cause condensation (a cold garage warming up on a humid morning is a classic trigger). If you're anywhere near a coast or in a basement shop, this is your primary enemy.</w:t>
+        <w:t xml:space="preserve"> Iron doesn't need standing water to rust. Ambient moisture in the 55-70% relative humidity range is enough on its own, and it gets worse fast when temperature swings cause condensation — a cold garage warming up on a humid morning is the classic trigger. Anywhere near a coast, or in a basement shop, this is the one that's actually coming for you.</w:t>
       </w:r>
     </w:p>
     <w:p>
@@ -105,7 +105,7 @@
         <w:t xml:space="preserve">Hand oils and sweat.</w:t>
       </w:r>
       <w:r>
-        <w:t xml:space="preserve"> Salt and skin oils are mildly corrosive on their own, and they also hold moisture against the surface longer than bare metal would. Leaning on the saw table with bare forearms while you work is enough to leave a rust outline days later.</w:t>
+        <w:t xml:space="preserve"> Salt and skin oils are mildly corrosive by themselves, and worse, they hold moisture against the surface far longer than bare metal would. Lean on the table with bare forearms while you work, and you'll have a rust outline to show for it days later.</w:t>
       </w:r>
     </w:p>
     <w:p>
@@ -116,7 +116,7 @@
         <w:t xml:space="preserve">Coolant and blade residue.</w:t>
       </w:r>
       <w:r>
-        <w:t xml:space="preserve"> If you're cutting anything with resin content (pine, fir, MDF with wax binders) the gummy residue that lands on the table holds moisture like a sponge. So does sawdust left sitting overnight — it's hygroscopic and will wick humidity straight into the iron underneath it.</w:t>
+        <w:t xml:space="preserve"> Cut anything with resin in it — pine, fir, MDF with wax binders — and the gummy residue that lands on the table holds moisture like a sponge. Sawdust left sitting overnight does the same thing. It's hygroscopic. It'll wick humidity straight into the iron underneath it while you sleep.</w:t>
       </w:r>
     </w:p>
     <w:p>
@@ -145,7 +145,7 @@
     </w:p>
     <w:p>
       <w:r>
-        <w:t xml:space="preserve">This is the process to use when a top has gone a while without attention, or once a season as a deeper reset:</w:t>
+        <w:t xml:space="preserve">Use this when a top has gone too long without attention, or once a season as a deeper reset. Five steps, none of them hard:</w:t>
       </w:r>
     </w:p>
     <w:p>
@@ -156,7 +156,7 @@
         <w:t xml:space="preserve">1. Degrease first.</w:t>
       </w:r>
       <w:r>
-        <w:t xml:space="preserve"> Wipe the whole top down with mineral spirits or a citrus-based degreaser on a rag. This pulls off oil, wax residue, and grime so you're not sanding contamination into the pores of the metal.</w:t>
+        <w:t xml:space="preserve"> Wipe the whole top down with mineral spirits or a citrus-based degreaser on a rag. This pulls off oil, wax residue, and grime so you're not sanding contamination straight into the pores of the metal.</w:t>
       </w:r>
     </w:p>
     <w:p>
@@ -167,7 +167,7 @@
         <w:t xml:space="preserve">2. Hit stubborn spots with a fine abrasive.</w:t>
       </w:r>
       <w:r>
-        <w:t xml:space="preserve"> For light surface rust, a gray or maroon </w:t>
+        <w:t xml:space="preserve"> Light surface rust: a gray or maroon </w:t>
       </w:r>
       <w:hyperlink r:id="rIdLink0">
         <w:r>
@@ -179,7 +179,7 @@
         </w:r>
       </w:hyperlink>
       <w:r>
-        <w:t xml:space="preserve"> with a few drops of mineral spirits will lift it without scratching. For actual pitting or stubborn rings, 000 or 0000 steel wool with a light machine oil as a lubricant works, but always go with the grain direction you're wiping in, not circles — circular scratches catch the light and are hard to undo. Never reach for coarse sandpaper or a bench grinder wire wheel on a saw top; both remove metal unevenly and will telegraph as a low spot forever.</w:t>
+        <w:t xml:space="preserve"> with a few drops of mineral spirits lifts it without scratching. Actual pitting or stubborn rings: 000 or 0000 steel wool with a light machine oil as lubricant. Either way, work with the grain you're wiping in, never circles — circular scratches catch the light and you will not undo them. And don't even think about reaching for coarse sandpaper or a bench grinder wire wheel on a saw top. Both remove metal unevenly. That low spot is permanent.</w:t>
       </w:r>
     </w:p>
     <w:p>
@@ -190,7 +190,7 @@
         <w:t xml:space="preserve">3. Neutralize and dry completely.</w:t>
       </w:r>
       <w:r>
-        <w:t xml:space="preserve"> If you used anything water-based, dry the top immediately and thoroughly — cast iron will flash-rust within the hour if left damp, sometimes faster in humid weather.</w:t>
+        <w:t xml:space="preserve"> Used anything water-based? Dry the top immediately and thoroughly. Cast iron will flash-rust within the hour if you leave it damp — faster than that in humid weather.</w:t>
       </w:r>
     </w:p>
     <w:p>
@@ -201,7 +201,7 @@
         <w:t xml:space="preserve">4. Apply your protective layer.</w:t>
       </w:r>
       <w:r>
-        <w:t xml:space="preserve"> See the comparison below for which one. Apply in thin, even coats and let it haze over per the product's directions before buffing.</w:t>
+        <w:t xml:space="preserve"> Which one depends on your situation — see below. Thin, even coats, let it haze over per the product's directions, then buff.</w:t>
       </w:r>
     </w:p>
     <w:p>
@@ -212,7 +212,7 @@
         <w:t xml:space="preserve">5. Buff to a hard, dry finish.</w:t>
       </w:r>
       <w:r>
-        <w:t xml:space="preserve"> A clean microfiber cloth or an old cotton t-shirt works fine. You want the surface to feel slick and dry to the touch, not tacky — tacky means you left too much product on, and it'll grab dust.</w:t>
+        <w:t xml:space="preserve"> A clean microfiber cloth or an old cotton t-shirt does the job. You're aiming for slick and dry to the touch. Tacky means you left too much product on, and it's going to grab every bit of dust in the shop.</w:t>
       </w:r>
     </w:p>
     <w:p>
@@ -225,7 +225,7 @@
     </w:p>
     <w:p>
       <w:r>
-        <w:t xml:space="preserve">All three work. Which one is right depends more on your climate and how often you're in the shop than on which is "best."</w:t>
+        <w:t xml:space="preserve">The simple answer: all three work. The real answer is that "best" depends on your climate and how often you're actually in the shop, not on the label.</w:t>
       </w:r>
     </w:p>
     <w:p>
@@ -248,7 +248,7 @@
         </w:r>
       </w:hyperlink>
       <w:r>
-        <w:t xml:space="preserve"> is the classic shop choice) gives you the slickest surface for feeding stock, which matters as much for safety as for rust prevention — less friction means less tendency to bind or kick back. It holds up well in moderate, stable climates but needs reapplication every 2-4 weeks in a humid shop since it's a physical barrier that thins out with use and cleaning.</w:t>
+        <w:t xml:space="preserve"> is the classic shop choice) gives you the slickest surface for feeding stock — and that's not just convenience, it's safety, since less friction means less tendency to bind or kick back. It holds up fine in a moderate, stable climate. In a humid shop, plan on reapplying every 2-4 weeks, because it's a physical barrier and physical barriers thin out with use.</w:t>
       </w:r>
     </w:p>
     <w:p>
@@ -283,7 +283,7 @@
         </w:r>
       </w:hyperlink>
       <w:r>
-        <w:t xml:space="preserve"> dry to a hard, waxy film rather than staying wet, so they don't attract dust the way a bare oil would. T-9 in particular is built for marine and aviation-grade corrosion resistance and is the better call if you're in a genuinely humid climate (Gulf Coast, Pacific Northwest) or a shop that isn't climate controlled. TopCote goes on thinner and glides a little better for pure feed-friction, but doesn't last quite as long between coats.</w:t>
+        <w:t xml:space="preserve"> dry to a hard, waxy film instead of staying wet, so they don't attract dust the way a bare oil does. T-9 is built for marine and aviation-grade corrosion resistance, which tells you exactly when to reach for it — a genuinely humid climate (Gulf Coast, Pacific Northwest) or a shop with no climate control. TopCote goes on thinner and glides a little better, but it doesn't last quite as long between coats. Pick your tradeoff.</w:t>
       </w:r>
     </w:p>
     <w:p>
@@ -294,7 +294,7 @@
         <w:t xml:space="preserve">Camellia oil</w:t>
       </w:r>
       <w:r>
-        <w:t xml:space="preserve"> is the traditional choice for fine hand tools and is popular with people who work a lot of Japanese saws, chisels, and planes alongside their power tools. It's food-safe-adjacent, doesn't gum up, and smells a lot better than mineral spirits-based products. Its downside is it's a true oil, not a hard film, so on a table saw top that sees heavy stock-sliding traffic it needs reapplying weekly, sometimes more in a damp shop. It's a better fit for dry climates or for tools that sit rather than get slid on constantly.</w:t>
+        <w:t xml:space="preserve"> is the traditional choice for fine hand tools, and it's popular with anyone running Japanese saws, chisels, and planes alongside the power tools. Food-safe-adjacent, doesn't gum up, smells better than anything mineral-spirits-based. Here's the catch: it's a true oil, not a hard film, so a table saw top that sees heavy stock-sliding traffic needs it weekly — more than that in a damp shop. Save it for dry climates, or for tools that mostly sit rather than get slid on all day.</w:t>
       </w:r>
     </w:p>
     <w:p>
@@ -323,12 +323,12 @@
     </w:p>
     <w:p>
       <w:r>
-        <w:t xml:space="preserve">The deep clean above is for damage that's already happened. The habit that actually keeps it from happening again takes 30 seconds: at the end of your last cut for the day, brush loose dust off the top, then wipe it down dry with a clean rag. Once a week, follow that with a light pass of whatever inhibitor you're using — you don't need a full strip-and-reapply, just enough to refresh the barrier in high-contact zones like where the fence rides and where you rest stock. Keep a rag and your spray or wax within arm's reach of the saw; the habit only sticks if it's a five-second detour, not a project.</w:t>
-      </w:r>
-    </w:p>
-    <w:p>
-      <w:r>
-        <w:t xml:space="preserve">Once your tops are protected, it's worth keeping a simple log of what you own and when you last serviced it so this doesn't slip during a busy stretch — </w:t>
+        <w:t xml:space="preserve">Everything above is damage control. This is the part that actually prevents it, and it takes 30 seconds: at the end of your last cut for the day, brush the loose dust off the top and wipe it down dry with a clean rag. Once a week, follow that with a light pass of whatever inhibitor you're using. You don't need a full strip-and-reapply — just enough to refresh the barrier where the fence rides and where you rest stock, the high-contact zones that take the abuse. Keep the rag and your spray or wax within arm's reach of the saw. That's the whole trick. A habit only survives if it's a five-second detour, not a project you have to talk yourself into.</w:t>
+      </w:r>
+    </w:p>
+    <w:p>
+      <w:r>
+        <w:t xml:space="preserve">Once your tops are actually protected, keep a simple log of what you own and when you last serviced it, so it doesn't quietly slip during a busy stretch — </w:t>
       </w:r>
       <w:hyperlink r:id="rIdLink4">
         <w:r>

</xml_diff>

<commit_message>
Regenerate article.docx with the Bumblechute's Shop Wax fix
Co-Authored-By: Claude Sonnet 5 <noreply@anthropic.com>
</commit_message>
<xml_diff>
--- a/Articles/01-cast-iron-rust-free/article.docx
+++ b/Articles/01-cast-iron-rust-free/article.docx
@@ -236,7 +236,7 @@
         <w:t xml:space="preserve">Paste wax</w:t>
       </w:r>
       <w:r>
-        <w:t xml:space="preserve"> (</w:t>
+        <w:t xml:space="preserve"> gives you the slickest surface for feeding stock — and that's not just convenience, it's safety, since less friction means less tendency to bind or kick back. Johnson's Paste Wax used to be the classic shop answer here. "Used to" is doing a lot of work in that sentence — they discontinued it, so unless you've still got an old can hiding in a drawer somewhere, it's not an option anymore, it's a memory. </w:t>
       </w:r>
       <w:hyperlink r:id="rIdLink1">
         <w:r>
@@ -244,11 +244,11 @@
             <w:color w:val="1E3A8A"/>
             <w:u w:val="single"/>
           </w:rPr>
-          <w:t xml:space="preserve">Johnson's Paste Wax</w:t>
+          <w:t xml:space="preserve">Bumblechute's Shop Wax</w:t>
         </w:r>
       </w:hyperlink>
       <w:r>
-        <w:t xml:space="preserve"> is the classic shop choice) gives you the slickest surface for feeding stock — and that's not just convenience, it's safety, since less friction means less tendency to bind or kick back. It holds up fine in a moderate, stable climate. In a humid shop, plan on reapplying every 2-4 weeks, because it's a physical barrier and physical barriers thin out with use.</w:t>
+        <w:t xml:space="preserve"> is the real answer now — a proper shop-grade paste wax built for exactly this job. Either way, it holds up fine in a moderate, stable climate. In a humid shop, plan on reapplying every 2-4 weeks, because it's a physical barrier, and physical barriers thin out with use.</w:t>
       </w:r>
     </w:p>
     <w:p>

</xml_diff>

<commit_message>
Regenerate all 18 article docx files -- byline was silently dropped
Root cause: the docx generator's paragraph tokenizer only matched a bare
<p>, so the styled kerphplans.com byline (<p style="...">) fell through
untouched and its content was silently dropped from every generated docx
since the byline was added -- despite being correct in article.html the
whole time. Fixed the tokenizer to match any <p ...> and give the byline
its own small-gray rendering. Also found and fixed a second bug this
exposed: &middot; and &times; weren't in the entity-decode table, so the
byline's middle dot would have rendered as literal "&amp;middot;" text
once it started showing up at all. All 18 regenerated and validated
(XML well-formed, every hyperlink/image relationship resolves, byline
text confirmed present). 06-hearing-protection is still locked (open in
Word) and needs one more regeneration once it's closed.
</commit_message>
<xml_diff>
--- a/Articles/01-cast-iron-rust-free/article.docx
+++ b/Articles/01-cast-iron-rust-free/article.docx
@@ -66,6 +66,19 @@
             </a:graphic>
           </wp:inline>
         </w:drawing>
+      </w:r>
+    </w:p>
+    <w:p>
+      <w:pPr>
+        <w:spacing w:after="200"/>
+      </w:pPr>
+      <w:r>
+        <w:rPr>
+          <w:sz w:val="16"/>
+          <w:color w:val="94A3B8"/>
+          <w:caps/>
+        </w:rPr>
+        <w:t xml:space="preserve">Kerph Garage Tips · kerphplans.com</w:t>
       </w:r>
     </w:p>
     <w:p>

</xml_diff>